<commit_message>
Added document comparison feature and AI enhancements
</commit_message>
<xml_diff>
--- a/backend/generated_reports/summary.docx
+++ b/backend/generated_reports/summary.docx
@@ -14,83 +14,77 @@
       <w:r>
         <w:t># 📄 Executive Overview</w:t>
         <w:br/>
-        <w:t>This document is about Agentic AI, a type of AI that can interact with its environment and make decisions autonomously. The main objective is to understand how Agentic AI works and build applications using this technology.</w:t>
         <w:br/>
-        <w:br/>
-        <w:t>The document covers topics such as:</w:t>
-        <w:br/>
-        <w:br/>
-        <w:t>* Retrieval augmented generation Rag Works</w:t>
-        <w:br/>
-        <w:t>* Building semantic search applications using embeddings</w:t>
-        <w:br/>
-        <w:t>* Store retrieve embeddings using vector databases</w:t>
-        <w:br/>
-        <w:t>* Understanding AI agents and their workflows</w:t>
-        <w:br/>
-        <w:br/>
-        <w:t>The key takeaways are:</w:t>
-        <w:br/>
-        <w:br/>
-        <w:t>* Agentic AI allows models to answer questions using data from internal knowledge</w:t>
-        <w:br/>
-        <w:t>* Rag Works solves problems of retrieving relevant information from external documents</w:t>
-        <w:br/>
-        <w:t>* Semantic understanding is crucial for recommendation systems and document retrieval</w:t>
-        <w:br/>
-        <w:t>* Hybrid search combines keyword search with semantic search for better accuracy</w:t>
+        <w:t>This document is about the Rag Agentic AI Internship Training Program, specifically covering Module 16 and 17. The main objective is to understand retrieval, augmented generation, and semantic search applications using embeddings. The overall learning outcome is to build production-ready AI systems.</w:t>
         <w:br/>
         <w:br/>
         <w:t># 📚 Major Topics</w:t>
         <w:br/>
         <w:br/>
-        <w:t>* Retrieval augmented generation Rag Works</w:t>
+        <w:t>* Retrieval Augmented Generation</w:t>
         <w:br/>
-        <w:t>* Agentic AI agents and their workflows</w:t>
+        <w:t>* Semantic Search Applications</w:t>
         <w:br/>
-        <w:t>* Building semantic search applications using embeddings</w:t>
+        <w:t>* Embeddings</w:t>
         <w:br/>
-        <w:t>* Store retrieve embeddings using vector databases</w:t>
+        <w:t>* Vector Databases</w:t>
         <w:br/>
-        <w:t>* Hybrid search combining keyword search with semantic search</w:t>
+        <w:t>* Agentic AI Workflows</w:t>
+        <w:br/>
+        <w:t>* Building AI Applications with FastAPI</w:t>
+        <w:br/>
+        <w:t>* Creating Intelligent Research Assistants</w:t>
         <w:br/>
         <w:br/>
         <w:t># 🧠 Key Concepts</w:t>
         <w:br/>
         <w:br/>
-        <w:t>* Agentic AI allows models to interact with its environment and make decisions autonomously</w:t>
+        <w:t>### Retrieval Augmented Generation Rag</w:t>
         <w:br/>
-        <w:t>* Retrieval augmented generation Rag Works solves problems of retrieving relevant information from external documents</w:t>
         <w:br/>
-        <w:t>* Semantic understanding is crucial for recommendation systems and document retrieval</w:t>
+        <w:t>Rag is a powerful tool for retrieving relevant information from external documents. It uses embeddings to convert text into numerical vectors, allowing for efficient storage and retrieval of information.</w:t>
         <w:br/>
-        <w:t>* Hybrid search combines keyword search with semantic search for better accuracy</w:t>
+        <w:br/>
+        <w:t>### Semantic Search</w:t>
+        <w:br/>
+        <w:br/>
+        <w:t>Semantic search understands the meaning behind a query and matches it with relevant chunks in the database. This approach provides higher accuracy than traditional keyword-based searches.</w:t>
+        <w:br/>
+        <w:br/>
+        <w:t>### Agentic AI Workflows</w:t>
+        <w:br/>
+        <w:br/>
+        <w:t>Agentic AI agents think, plan, and use tools to complete tasks autonomously. They understand goals, plans tasks, make decisions, and remember information.</w:t>
+        <w:br/>
+        <w:br/>
+        <w:t>### FastAPI and Building AI Applications</w:t>
+        <w:br/>
+        <w:br/>
+        <w:t>FastAPI is a modern Python web framework used for building backend AI applications. It provides features such as automatic API documentation, dependency injection, and error handling.</w:t>
         <w:br/>
         <w:br/>
         <w:t># 📌 Important Definitions</w:t>
         <w:br/>
         <w:br/>
-        <w:t>* Agentic AI: a type of AI that can interact with its environment and make decisions autonomously</w:t>
+        <w:t>* Embeddings: Convert text into numerical vectors for efficient storage and retrieval.</w:t>
         <w:br/>
-        <w:t>* Rag Works: a technology that solves problems of retrieving relevant information from external documents</w:t>
+        <w:t>* Vector Databases: Store embeddings instead of plain text for fast search queries.</w:t>
         <w:br/>
-        <w:t>* Embeddings: numerical vectors used to represent text data in a vector space</w:t>
+        <w:t>* Rag: A tool for retrieving relevant information from external documents using embeddings.</w:t>
         <w:br/>
         <w:br/>
         <w:t># ⭐ Key Takeaways</w:t>
         <w:br/>
         <w:br/>
-        <w:t>* Agentic AI allows models to answer questions using data from internal knowledge</w:t>
+        <w:t>* Understand retrieval augmented generation rag and its applications.</w:t>
         <w:br/>
-        <w:t>* Retrieval augmented generation Rag Works solves problems of retrieving relevant information from external documents</w:t>
+        <w:t>* Learn about semantic search and its advantages over traditional keyword-based searches.</w:t>
         <w:br/>
-        <w:t>* Semantic understanding is crucial for recommendation systems and document retrieval</w:t>
+        <w:t>* Familiarize yourself with agentic AI workflows and their benefits.</w:t>
         <w:br/>
-        <w:t>* Hybrid search combines keyword search with semantic search for better accuracy</w:t>
+        <w:t>* Use FastAPI to build production-ready AI applications.</w:t>
         <w:br/>
-        <w:t>* Faiss and ChromaDB are popular vector databases used in Agentic AI applications</w:t>
-        <w:br/>
-        <w:t>* FastAPI is a modern Python web framework used to build backend AI applications.</w:t>
+        <w:t>* Create intelligent research assistants using Rag and vector databases.</w:t>
       </w:r>
     </w:p>
     <w:sectPr>

</xml_diff>